<commit_message>
Blank trigger mind-map: remove central company node
</commit_message>
<xml_diff>
--- a/APC-Trigger-MindMap-BLANK.docx
+++ b/APC-Trigger-MindMap-BLANK.docx
@@ -16,55 +16,6 @@
         <w:t>Part 2 — Trigger mind map (exam focus)</w:t>
       </w:r>
     </w:p>
-    <w:tbl>
-      <w:tblPr>
-        <w:tblW w:type="auto" w:w="0"/>
-        <w:jc w:val="center"/>
-        <w:tblLook w:firstColumn="1" w:firstRow="1" w:lastColumn="0" w:lastRow="0" w:noHBand="0" w:noVBand="1" w:val="04A0"/>
-      </w:tblPr>
-      <w:tblGrid>
-        <w:gridCol w:w="10224"/>
-      </w:tblGrid>
-      <w:tr>
-        <w:tc>
-          <w:tcPr>
-            <w:tcW w:type="dxa" w:w="4896"/>
-            <w:tcBorders>
-              <w:top w:val="single" w:sz="18" w:space="0" w:color="1f3d6b"/>
-              <w:left w:val="single" w:sz="18" w:space="0" w:color="1f3d6b"/>
-              <w:bottom w:val="single" w:sz="18" w:space="0" w:color="1f3d6b"/>
-              <w:right w:val="single" w:sz="18" w:space="0" w:color="1f3d6b"/>
-            </w:tcBorders>
-            <w:shd w:val="clear" w:fill="eef2f8"/>
-          </w:tcPr>
-          <w:p>
-            <w:pPr>
-              <w:jc w:val="center"/>
-            </w:pPr>
-            <w:r>
-              <w:rPr>
-                <w:b/>
-                <w:color w:val="1F3D6B"/>
-                <w:sz w:val="28"/>
-              </w:rPr>
-              <w:t>[ COMPANY NAME ]</w:t>
-            </w:r>
-          </w:p>
-          <w:p>
-            <w:pPr>
-              <w:jc w:val="center"/>
-            </w:pPr>
-            <w:r>
-              <w:rPr>
-                <w:color w:val="666666"/>
-                <w:sz w:val="18"/>
-              </w:rPr>
-              <w:t>[ Exam ] — main triggers &amp; sub-triggers</w:t>
-            </w:r>
-          </w:p>
-        </w:tc>
-      </w:tr>
-    </w:tbl>
     <w:p>
       <w:pPr>
         <w:jc w:val="center"/>
@@ -74,7 +25,7 @@
           <w:color w:val="666666"/>
           <w:sz w:val="18"/>
         </w:rPr>
-        <w:t>Central = the company   ·   each box = a main trigger   ·   bullets = the sub-triggers to focus on for the exam</w:t>
+        <w:t>Each box = a main trigger   ·   bullets = the sub-triggers to focus on for the exam</w:t>
       </w:r>
     </w:p>
     <w:tbl>

</xml_diff>